<commit_message>
Allinea WP2 al codice WP4 (6 correzioni di coerenza)
Aggiorna il documento dei work package per renderlo coerente con
l'implementazione (il codice riflette le decisioni di progetto):
- rimuove il Diffie-Hellman AuthUnisa<->VoteCollector (canale via TLS)
- foglia Merkle = H(H(C) || H(token_id)) (non H(C)) in 2.2.6 e 2.2.8
- revoca via CRL; OCSP citato come alternativa non realizzata
- ricevuta (Merkle proof) emessa alla chiusura contro la radice firmata
- secret sharing sulla chiave Fernet che incapsula la privata RSA
- token con chiave pubblica effimera; Auth = firma effimera su C
</commit_message>
<xml_diff>
--- a/Project_work/wp1-wp2-wp3.docx
+++ b/Project_work/wp1-wp2-wp3.docx
@@ -3439,7 +3439,7 @@
         <w:rPr>
           <w:rtl w:val="0"/>
         </w:rPr>
-        <w:t xml:space="preserve">PKI con certificati X.509 emessi da UnisaCA per la distribuzione autentica delle chiavi pubbliche di tutti gli attori, con verifica di revoca tramite CRL/OCSP in modalità hard-fail;</w:t>
+        <w:t>PKI con certificati X.509 emessi da UnisaCA per la distribuzione autentica delle chiavi pubbliche di tutti gli attori, con verifica di revoca tramite CRL in modalità hard-fail (OCSP è l'alternativa online equivalente vista nel corso, non realizzata nella simulazione in-process);</w:t>
       </w:r>
     </w:p>
     <w:p>
@@ -3498,35 +3498,6 @@
           <w:rtl w:val="0"/>
         </w:rPr>
         <w:t xml:space="preserve">Token di autorizzazione anonimo, firmato da AuthUnisa con firma digitale RSA: certifica che il portatore è un avente diritto che non ha ancora votato, senza contenere né rivelare la sua identità, ed è verificabile da VoteCollector tramite la sola chiave pubblica di AuthUnisa;</w:t>
-      </w:r>
-    </w:p>
-    <w:p>
-      <w:pPr>
-        <w:spacing w:after="100" w:lineRule="auto"/>
-        <w:ind w:left="1080" w:hanging="360"/>
-        <w:jc w:val="both"/>
-        <w:rPr/>
-      </w:pPr>
-      <w:r>
-        <w:rPr>
-          <w:rtl w:val="0"/>
-        </w:rPr>
-        <w:t xml:space="preserve">•</w:t>
-      </w:r>
-      <w:r>
-        <w:rPr>
-          <w:rFonts w:ascii="Times New Roman" w:cs="Times New Roman" w:eastAsia="Times New Roman" w:hAnsi="Times New Roman"/>
-          <w:sz w:val="14"/>
-          <w:szCs w:val="14"/>
-          <w:rtl w:val="0"/>
-        </w:rPr>
-        <w:t xml:space="preserve">        </w:t>
-      </w:r>
-      <w:r>
-        <w:rPr>
-          <w:rtl w:val="0"/>
-        </w:rPr>
-        <w:t xml:space="preserve">Scambio di chiavi Diffie-Hellman autenticato (tramite certificati) per l'accordo della chiave condivisa tra AuthUnisa e VoteCollector, considerando la vulnerabilità al man-in-the-middle del DH non autenticato nota dalla teoria del corso;</w:t>
       </w:r>
     </w:p>
     <w:p>
@@ -3695,7 +3666,7 @@
         <w:rPr>
           <w:rtl w:val="0"/>
         </w:rPr>
-        <w:t xml:space="preserve">Il pseudoanonimato del modello (§1.1) richiede che chi raccoglie le schede possa accertare il diritto di voto del mittente senza conoscerne l'identità. La soluzione adotta un'autorizzazione anonima, costruita sul modello della scheda vidimata di un seggio tradizionale: il funzionario riconosce l'elettore e gli consegna una scheda timbrata ma priva di nome; lo scrutatore accetta la scheda sulla base del timbro, non dell'identità. Concretamente, conclusa con successo l'autenticazione, AuthUnisa genera un token recante un identificativo univoco e privo di riferimenti all'elettore, e lo firma con la propria chiave privata: il token = (id, attributi di validità), Sig_Auth = Sign(SK_AuthUnisa, H(token)). Il token attesta unicamente che il portatore è un avente diritto che non ha ancora ottenuto autorizzazione, e nulla più.</w:t>
+        <w:t>Il pseudoanonimato del modello (§1.1) richiede che chi raccoglie le schede possa accertare il diritto di voto del mittente senza conoscerne l'identità. La soluzione adotta un'autorizzazione anonima, costruita sul modello della scheda vidimata di un seggio tradizionale: il funzionario riconosce l'elettore e gli consegna una scheda timbrata ma priva di nome; lo scrutatore accetta la scheda sulla base del timbro, non dell'identità. Concretamente, conclusa con successo l'autenticazione, l'elettore genera per la sessione una coppia di chiavi effimere e ne trasmette la chiave pubblica ad AuthUnisa, che genera un token recante un identificativo univoco, la chiave pubblica effimera dell'elettore e nessun riferimento all'identità, e lo firma con la propria chiave privata: token = (id, PK_eff, attributi di validità), Sig_Auth = Sign(SK_AuthUnisa, id ‖ PK_eff). Il legame tra token e scheda (Auth) è la firma del ciphertext C con la chiave privata effimera, verificabile da VoteCollector con la PK_eff contenuta nel token, così da impedire il trasferimento del token su una scheda diversa. Il token attesta unicamente che il portatore è un avente diritto che non ha ancora ottenuto autorizzazione, e nulla più.</w:t>
       </w:r>
     </w:p>
     <w:p>
@@ -3743,7 +3714,7 @@
         <w:rPr>
           <w:rtl w:val="0"/>
         </w:rPr>
-        <w:t xml:space="preserve">Il modello (§1.5) assume l'onestà collegiale di VoteCounter: la capacità di aprire le schede non deve essere concentrata in un singolo membro, così che nessuno possa né anticipare lo scrutinio (violando S.3) né manipolarlo da solo. Il secret sharing è il meccanismo, interno al programma del corso, che realizza concretamente tale assunzione. La chiave privata di decifrazione di VoteCounter non è detenuta da alcun membro per intero: è suddivisa in quote distribuite ai membri della commissione, e la sua ricostruzione richiede la concorrenza di una soglia prestabilita di essi. L'operazione di ricostruzione è eseguita unicamente alla chiusura delle urne; prima di quel momento nessun gestore, nemmeno disponendo dell'intera infrastruttura di VoteCounter, possiede gli elementi per decifrare una scheda. Ciò neutralizza il tentativo di apertura anticipata di un singolo membro disonesto (The Counter) e riduce la fiducia richiesta dal sistema al minimo: l'unico scenario residuo è la collusione di un numero di membri pari alla soglia, dichiarato nel modello come rischio non eliminabile con i soli strumenti del corso. Questa costruzione realizza l'assunzione del §1.5 e sostiene la proprietà S.3 senza ricorrere a strumenti esterni al programma.</w:t>
+        <w:t>Il modello (§1.5) assume l'onestà collegiale di VoteCounter: la capacità di aprire le schede non deve essere concentrata in un singolo membro, così che nessuno possa né anticipare lo scrutinio (violando S.3) né manipolarlo da solo. Il secret sharing è il meccanismo, interno al programma del corso, che realizza concretamente tale assunzione. La chiave privata di decifrazione di VoteCounter non è detenuta da alcun membro per intero. Poiché il segreto frammentabile con lo schema a soglia è un intero inferiore al primo del campo, e un modulo RSA eccede tale dimensione, il secret sharing non si applica direttamente alla chiave RSA: la privata è incapsulata con una chiave simmetrica (Fernet, vista nel corso) ed è quest'ultima a essere suddivisa in quote distribuite ai membri della commissione. La ricostruzione della chiave simmetrica, e quindi l'accesso alla privata RSA, richiede la concorrenza di una soglia prestabilita di membri. L'operazione di ricostruzione è eseguita unicamente alla chiusura delle urne; prima di quel momento nessun gestore, nemmeno disponendo dell'intera infrastruttura di VoteCounter, possiede gli elementi per decifrare una scheda. Ciò neutralizza il tentativo di apertura anticipata di un singolo membro disonesto (The Counter) e riduce la fiducia richiesta dal sistema al minimo: l'unico scenario residuo è la collusione di un numero di membri pari alla soglia, dichiarato nel modello come rischio non eliminabile con i soli strumenti del corso. Questa costruzione realizza l'assunzione del §1.5 e sostiene la proprietà S.3 senza ricorrere a strumenti esterni al programma.</w:t>
       </w:r>
     </w:p>
     <w:p>
@@ -3813,7 +3784,7 @@
         <w:rPr>
           <w:rtl w:val="0"/>
         </w:rPr>
-        <w:t xml:space="preserve">Le schede registrate sono organizzate in un Merkle tree, struttura dati studiata nel corso (non si fa uso di blockchain né di alcun meccanismo di consenso distribuito). Ogni foglia è l'hash di una scheda registrata; la radice riassume l'intero contenuto dell'urna. Al momento della registrazione, VoteCollector rilascia all'elettore una ricevuta contenente la Merkle proof della propria scheda, ossia gli hash intermedi che, ricombinati, ricostruiscono la radice. La ricevuta consente la verifica individuale (VI.1): l'elettore verifica che la propria scheda concorra alla radice pubblicata. La radice, firmata da VoteCollector alla chiusura delle urne, è l'oggetto su cui si fondano sia la verifica universale dell'urna (VU.1) sia, come descritto in §2.3, la verifica del conteggio: qualsiasi modifica a una scheda interna altera la radice, rendendo la manomissione rilevabile (I.1). L'unicità del Merkle tree, studiata nel corso, garantisce che a una radice corrisponda un solo contenuto dell'urna, impedendo a VoteCollector di presentare urne diverse a verificatori diversi senza essere scoperta, e fornendo l'ancoraggio immutabile rispetto al quale lo scrutinio dovrà risultare coerente.</w:t>
+        <w:t>Le schede registrate sono organizzate in un Merkle tree, struttura dati studiata nel corso (non si fa uso di blockchain né di alcun meccanismo di consenso distribuito). Ogni foglia è l'hash del contenuto registrato, nella forma H(H(C) ‖ H(token_id)) a partire dal ciphertext C e dall'identificativo del token; la radice riassume l'intero contenuto dell'urna. Alla chiusura delle urne, congelato l'albero e firmata la radice, VoteCollector emette per ogni elettore una ricevuta contenente la Merkle proof della propria scheda, ossia gli hash intermedi che, ricombinati, ricostruiscono la radice firmata; alla sottomissione l'elettore ottiene soltanto conferma dell'avvenuta registrazione e la posizione della scheda. La ricevuta consente la verifica individuale (VI.1): l'elettore verifica che la propria scheda concorra alla radice pubblicata. La radice, firmata da VoteCollector alla chiusura delle urne, è l'oggetto su cui si fondano sia la verifica universale dell'urna (VU.1) sia, come descritto in §2.3, la verifica del conteggio: qualsiasi modifica a una scheda interna altera la radice, rendendo la manomissione rilevabile (I.1). L'unicità del Merkle tree, studiata nel corso, garantisce che a una radice corrisponda un solo contenuto dell'urna, impedendo a VoteCollector di presentare urne diverse a verificatori diversi senza essere scoperta, e fornendo l'ancoraggio immutabile rispetto al quale lo scrutinio dovrà risultare coerente.</w:t>
       </w:r>
     </w:p>
     <w:p>
@@ -3848,7 +3819,7 @@
         <w:rPr>
           <w:rtl w:val="0"/>
         </w:rPr>
-        <w:t xml:space="preserve">La verifica dei certificati include il controllo di revoca tramite CRL/OCSP. Come noto dalla teoria del corso, la modalità soft-fail (accettare un certificato quando lo stato di revoca non è ottenibile) è facilmente neutralizzabile da un attaccante attivo che blocchi le richieste di revoca. Durante la fase di voto si adotta pertanto la modalità hard-fail: in assenza di conferma esplicita di validità del certificato, la scheda viene rifiutata anziché accettata. Questa scelta privilegia l'integrità del corpo elettorale rispetto alla disponibilità: il costo è il possibile rifiuto di voti legittimi in caso di indisponibilità del servizio di revoca, ritenuto preferibile all'ammissione di un certificato potenzialmente revocato. Si dichiara esplicitamente la conseguenza di disponibilità: un avversario attivo sulla rete (The Eavesdropper, versione attiva) può sfruttare la modalità hard-fail come strumento di soppressione selettiva, bloccando le richieste di revoca di determinate categorie di elettori per indurne il rifiuto del voto; tale azione può mirare al disenfranchisement mirato o a far mancare il quorum di partecipazione. Il trade-off è ritenuto comunque preferibile, e l'attacco sarà analizzato in WP3.</w:t>
+        <w:t>La verifica dei certificati include il controllo di revoca tramite CRL (l'alternativa online equivalente vista nel corso, OCSP, non è realizzata nella simulazione in-process). Come noto dalla teoria del corso, la modalità soft-fail (accettare un certificato quando lo stato di revoca non è ottenibile) è facilmente neutralizzabile da un attaccante attivo che blocchi le richieste di revoca. Durante la fase di voto si adotta pertanto la modalità hard-fail: in assenza di conferma esplicita di validità del certificato, la scheda viene rifiutata anziché accettata. Questa scelta privilegia l'integrità del corpo elettorale rispetto alla disponibilità: il costo è il possibile rifiuto di voti legittimi in caso di indisponibilità del servizio di revoca, ritenuto preferibile all'ammissione di un certificato potenzialmente revocato. Si dichiara esplicitamente la conseguenza di disponibilità: un avversario attivo sulla rete (The Eavesdropper, versione attiva) può sfruttare la modalità hard-fail come strumento di soppressione selettiva, bloccando le richieste di revoca di determinate categorie di elettori per indurne il rifiuto del voto; tale azione può mirare al disenfranchisement mirato o a far mancare il quorum di partecipazione. Il trade-off è ritenuto comunque preferibile, e l'attacco sarà analizzato in WP3.</w:t>
       </w:r>
     </w:p>
     <w:p>
@@ -3896,7 +3867,7 @@
         <w:rPr>
           <w:rtl w:val="0"/>
         </w:rPr>
-        <w:t xml:space="preserve">La verificabilità universale del conteggio è ottenuta mediante pubblicazione dei chiari. VoteCounter pubblica, per ciascuna foglia dell'urna congelata, la coppia (C, v) costituita dal ciphertext registrato e dal valore di voto ottenuto dalla decifrazione. Chiunque può allora eseguire autonomamente due verifiche con i soli strumenti del corso: che l'hash H(C) di ogni ciphertext pubblicato corrisponda a una foglia certificata dalla radice firmata (Merkle proof), accertando che i chiari si riferiscano esattamente alle schede dell'urna e non ad altre; e che il riconteggio dei valori pubblicati restituisca gli aggregati annunciati. Le schede il cui chiaro non appartiene al dominio ammesso sono marcate come non valide e conteggiate a parte: il numero di scarti è pubblico e ricontrollabile (I.6). Il totale dei voti validi così ricalcolato è confrontato con la soglia di quorum (I.7). In questo modo l'esito non richiede fiducia nella correttezza aritmetica di VoteCounter: la terna (N_Sì, N_No, N_Bianca), il numero di scarti e il raggiungimento del quorum sono ricalcolabili da ogni osservatore a partire da dati pubblici ancorati alla radice firmata.</w:t>
+        <w:t>La verificabilità universale del conteggio è ottenuta mediante pubblicazione dei chiari. VoteCounter pubblica, per ciascuna foglia dell'urna congelata, la coppia (C, v) costituita dal ciphertext registrato e dal valore di voto ottenuto dalla decifrazione. Chiunque può allora eseguire autonomamente due verifiche con i soli strumenti del corso: che ogni ciphertext pubblicato, nella forma di foglia H(H(C) ‖ H(token_id)), corrisponda a una foglia certificata dalla radice firmata (Merkle proof), accertando che i chiari si riferiscano esattamente alle schede dell'urna e non ad altre; e che il riconteggio dei valori pubblicati restituisca gli aggregati annunciati. Le schede il cui chiaro non appartiene al dominio ammesso sono marcate come non valide e conteggiate a parte: il numero di scarti è pubblico e ricontrollabile (I.6). Il totale dei voti validi così ricalcolato è confrontato con la soglia di quorum (I.7). In questo modo l'esito non richiede fiducia nella correttezza aritmetica di VoteCounter: la terna (N_Sì, N_No, N_Bianca), il numero di scarti e il raggiungimento del quorum sono ricalcolabili da ogni osservatore a partire da dati pubblici ancorati alla radice firmata.</w:t>
       </w:r>
     </w:p>
     <w:p>
@@ -3994,7 +3965,7 @@
         <w:rPr>
           <w:rtl w:val="0"/>
         </w:rPr>
-        <w:t xml:space="preserve">UnisaCA emette i certificati X.509 di tutti gli attori; VoteCounter genera la coppia di chiavi di scrutinio e ne suddivide la componente privata tra i propri membri via secret sharing; la chiave pubblica di VoteCounter è distribuita tramite certificato, così che gli elettori possano cifrare le schede; AuthUnisa e VoteCollector concordano una chiave condivisa via Diffie-Hellman autenticato per la protezione del proprio canale.</w:t>
+        <w:t>UnisaCA emette i certificati X.509 di tutti gli attori; VoteCounter genera la coppia di chiavi di scrutinio e ne suddivide la componente privata tra i propri membri via secret sharing; la chiave pubblica di VoteCounter è distribuita tramite certificato, così che gli elettori possano cifrare le schede; i canali di comunicazione tra gli attori sono protetti da TLS.</w:t>
       </w:r>
     </w:p>
     <w:p>
@@ -4068,7 +4039,7 @@
         <w:rPr>
           <w:rtl w:val="0"/>
         </w:rPr>
-        <w:t xml:space="preserve">l'elettore costruisce la scheda (C, token, Auth) secondo Encrypt-then-Authenticate, cifrando il proprio voto con la chiave pubblica certificata di VoteCounter e legando il token al ciphertext; VoteCollector verifica la firma del token con la chiave pubblica di AuthUnisa, controlla che il token non sia già speso e che il legame con il ciphertext sia valido, registra la scheda come foglia del Merkle tree e restituisce la Merkle proof come ricevuta.</w:t>
+        <w:t>l'elettore costruisce la scheda (C, token, Auth) secondo Encrypt-then-Authenticate, cifrando il proprio voto con la chiave pubblica certificata di VoteCounter e legando il token al ciphertext; VoteCollector verifica la firma del token con la chiave pubblica di AuthUnisa, controlla che il token non sia già speso e che il legame con il ciphertext sia valido, registra la scheda come foglia del Merkle tree e ne conferma la posizione; la ricevuta con la Merkle proof è emessa alla chiusura, contro la radice firmata.</w:t>
       </w:r>
     </w:p>
     <w:p>

</xml_diff>

<commit_message>
Rifinitura stilistica WP1-WP3 e due assunzioni esplicite in §1.5
- Rimosse 7 aperture filler ("In questo capitolo/paragrafo verranno...",
  "Di seguito vengono presentati...") in favore di formulazioni dirette.
- Aggiunti due compromessi dichiarati in §1.5: voto definitivo (no
  sostituzione/revoca, motivato da S.2/S.6 e urna ad accodamento) ed
  efficienza come vincolo progettuale (primitive a basso costo, verifiche
  lineari, quantificazione in WP4), a copertura dei requisiti di traccia.
</commit_message>
<xml_diff>
--- a/Project_work/wp1-wp2-wp3.docx
+++ b/Project_work/wp1-wp2-wp3.docx
@@ -34,7 +34,7 @@
         <w:rPr>
           <w:rtl w:val="0"/>
         </w:rPr>
-        <w:t xml:space="preserve">In questo capitolo verranno definiti gli attori onesti del sistema e i vari avversari interessati a comprometterlo. Verrà dettagliata la funzionalità che si intende realizzare — la conduzione di un'elezione elettronica sicura con garanzie di autenticità, unicità, segretezza, integrità e verificabilità — e le proprietà che il sistema deve preservare in presenza di attacchi.</w:t>
+        <w:t>Questo capitolo definisce gli attori onesti del sistema e gli avversari interessati a comprometterlo, la funzionalità da realizzare — la conduzione di un'elezione elettronica sicura con garanzie di autenticità, unicità, segretezza, integrità e verificabilità — e le proprietà che il sistema deve preservare in presenza di attacchi.</w:t>
       </w:r>
     </w:p>
     <w:p>
@@ -95,7 +95,7 @@
         <w:rPr>
           <w:rtl w:val="0"/>
         </w:rPr>
-        <w:t xml:space="preserve">In questo paragrafo verranno presentati gli attori onesti coinvolti nel sistema, ognuno con obiettivi e funzioni specifiche.</w:t>
+        <w:t>Gli attori onesti del sistema, ciascuno con obiettivi e funzioni specifiche, sono i seguenti.</w:t>
       </w:r>
     </w:p>
     <w:p>
@@ -352,7 +352,7 @@
         <w:rPr>
           <w:rtl w:val="0"/>
         </w:rPr>
-        <w:t xml:space="preserve">Di seguito vengono presentati gli avversari interessati a compromettere il sistema, specificandone tipologia, descrizione, risorse e capacità. Gli avversari sono contestualizzati nello scenario universitario per rendere concreti gli obiettivi di attacco.</w:t>
+        <w:t>Gli avversari interessati a compromettere il sistema sono presentati di seguito con tipologia, descrizione, risorse e capacità, contestualizzati nello scenario universitario per rendere concreti gli obiettivi di attacco.</w:t>
       </w:r>
     </w:p>
     <w:p>
@@ -1711,7 +1711,7 @@
         <w:rPr>
           <w:rtl w:val="0"/>
         </w:rPr>
-        <w:t xml:space="preserve">In questo paragrafo verranno identificate le proprietà da preservare in presenza di attacchi. Le proprietà sono organizzate secondo le sei categorie indicate dalla traccia: autenticità, unicità, segretezza, integrità, verificabilità individuale e verificabilità universale. Ogni proprietà è identificata da un codice che ne consentirà il riferimento puntuale nell'analisi di sicurezza (WP3).</w:t>
+        <w:t>Le proprietà da preservare in presenza di attacchi sono organizzate secondo le sei categorie indicate dalla traccia: autenticità, unicità, segretezza, integrità, verificabilità individuale e verificabilità universale. Ogni proprietà è identificata da un codice che ne consentirà il riferimento puntuale nell'analisi di sicurezza (WP3).</w:t>
       </w:r>
     </w:p>
     <w:p>
@@ -2840,7 +2840,7 @@
         <w:rPr>
           <w:rtl w:val="0"/>
         </w:rPr>
-        <w:t xml:space="preserve">In questo paragrafo viene descritto il comportamento del sistema nel caso in cui tutte le parti si comportino in maniera onesta e operino come stabilito, garantendo le proprietà descritte precedentemente.</w:t>
+        <w:t>Con tutte le parti oneste e operanti come stabilito, il sistema garantisce le proprietà descritte e si comporta come segue:</w:t>
       </w:r>
     </w:p>
     <w:p>
@@ -3189,6 +3189,80 @@
     </w:p>
     <w:p>
       <w:pPr>
+        <w:spacing w:after="100" w:lineRule="auto"/>
+        <w:ind w:left="1080" w:hanging="360"/>
+        <w:jc w:val="both"/>
+        <w:rPr/>
+      </w:pPr>
+      <w:r>
+        <w:rPr>
+          <w:rtl w:val="0"/>
+        </w:rPr>
+        <w:t xml:space="preserve">•</w:t>
+      </w:r>
+      <w:r>
+        <w:rPr>
+          <w:rFonts w:ascii="Times New Roman" w:cs="Times New Roman" w:eastAsia="Times New Roman" w:hAnsi="Times New Roman"/>
+          <w:sz w:val="14"/>
+          <w:szCs w:val="14"/>
+          <w:rtl w:val="0"/>
+        </w:rPr>
+        <w:t xml:space="preserve">        </w:t>
+      </w:r>
+      <w:r>
+        <w:rPr>
+          <w:b w:val="1"/>
+          <w:bCs w:val="1"/>
+          <w:rtl w:val="0"/>
+        </w:rPr>
+        <w:t xml:space="preserve">Voto definitivo (scelta dichiarata). </w:t>
+      </w:r>
+      <w:r>
+        <w:rPr>
+          <w:rtl w:val="0"/>
+        </w:rPr>
+        <w:t>Una volta registrata la scheda nell'urna, il voto è definitivo: non sono previste né la sua sostituzione né la sua revoca. La scelta discende dal modello stesso. L'anonimato della scheda (S.2) impedisce di ricondurre un record a chi lo ha espresso, e il registro dei token già utilizzati impedisce a un medesimo autorizzato di registrarne un secondo; una procedura di sostituzione richiederebbe perciò di riaprire il legame fra elettore e scheda, indebolendo proprio la segretezza che il sistema intende garantire. La possibilità di rivotare aprirebbe inoltre un canale di coercizione — un coercitore potrebbe imporre l'ultimo voto — in contrasto con S.6. L'urna è quindi trattata come registro ad accodamento, senza cancellazioni: il compromesso è accettato esplicitamente in favore di anonimato e resistenza alla coercizione.</w:t>
+      </w:r>
+    </w:p>
+    <w:p>
+      <w:pPr>
+        <w:spacing w:after="100" w:lineRule="auto"/>
+        <w:ind w:left="1080" w:hanging="360"/>
+        <w:jc w:val="both"/>
+        <w:rPr/>
+      </w:pPr>
+      <w:r>
+        <w:rPr>
+          <w:rtl w:val="0"/>
+        </w:rPr>
+        <w:t xml:space="preserve">•</w:t>
+      </w:r>
+      <w:r>
+        <w:rPr>
+          <w:rFonts w:ascii="Times New Roman" w:cs="Times New Roman" w:eastAsia="Times New Roman" w:hAnsi="Times New Roman"/>
+          <w:sz w:val="14"/>
+          <w:szCs w:val="14"/>
+          <w:rtl w:val="0"/>
+        </w:rPr>
+        <w:t xml:space="preserve">        </w:t>
+      </w:r>
+      <w:r>
+        <w:rPr>
+          <w:b w:val="1"/>
+          <w:bCs w:val="1"/>
+          <w:rtl w:val="0"/>
+        </w:rPr>
+        <w:t xml:space="preserve">Efficienza come vincolo progettuale. </w:t>
+      </w:r>
+      <w:r>
+        <w:rPr>
+          <w:rtl w:val="0"/>
+        </w:rPr>
+        <w:t>L'efficienza è assunta come vincolo di progetto e non come obiettivo accessorio: la traccia richiede un compromesso ragionevole tra efficienza, trasparenza, segretezza e sicurezza. Il modello privilegia perciò, tra le primitive del corso, quelle a basso costo computazionale, e verifiche pubbliche deterministiche di costo lineare nel numero di schede, evitando costruzioni il cui onere cresca in modo superlineare o richieda interazione ripetuta. La quantificazione concreta dei costi (tempi delle operazioni crittografiche e dimensioni dei messaggi) è demandata alla misurazione sperimentale in WP4.</w:t>
+      </w:r>
+    </w:p>
+    <w:p>
+      <w:pPr>
         <w:rPr/>
       </w:pPr>
       <w:r>
@@ -3230,7 +3304,7 @@
         <w:rPr>
           <w:rtl w:val="0"/>
         </w:rPr>
-        <w:t xml:space="preserve">In questo capitolo viene presentata la soluzione al modello del WP1, con l'obiettivo di raggiungere un compromesso ragionevole tra efficienza, trasparenza, segretezza e sicurezza. L'impostazione crittografica e le scelte di costruzione sono definite e motivate; la specifica esatta dei formati di messaggio è dettagliata nell'implementazione (WP4). Tutti gli strumenti impiegati appartengono al programma del corso.</w:t>
+        <w:t>Questo capitolo presenta la soluzione al modello di WP1, con l'obiettivo di un compromesso ragionevole tra efficienza, trasparenza, segretezza e sicurezza. L'impostazione crittografica e le scelte di costruzione sono definite e motivate; la specifica esatta dei formati di messaggio è dettagliata nell'implementazione (WP4). Tutti gli strumenti impiegati appartengono al programma del corso.</w:t>
       </w:r>
     </w:p>
     <w:p>
@@ -4122,7 +4196,7 @@
         <w:rPr>
           <w:rtl w:val="0"/>
         </w:rPr>
-        <w:t xml:space="preserve">In questo capitolo si analizza la sicurezza della soluzione presentata in WP2 rispetto al modello definito in WP1. L'analisi procede per categoria di proprietà — autenticità, unicità, segretezza, integrità, verificabilità individuale e verificabilità universale — e, per ciascuna, individua gli avversari del paragrafo 1.2 in grado di minacciarla, descrive il loro attacco contro i meccanismi di WP2 e valuta l'esito. La valutazione di ciascuna proprietà è qualitativa e assume uno di tre livelli: soddisfatta (il meccanismo la garantisce contro tutti gli avversari del modello), parzialmente soddisfatta (garantita contro gli avversari realistici ma non contro uno scenario massimale esplicitamente dichiarato in WP1), non soddisfatta (il modello non la garantisce con gli strumenti adottati). Per le proprietà non pienamente soddisfatte si discutono le alternative considerate e le ragioni per cui non migliorano la proprietà senza degradarne altre. Tutte le valutazioni si fondano sulle assunzioni di fiducia dichiarate in §1.5; il superamento di tali assunzioni esula dal perimetro analizzato.</w:t>
+        <w:t>Questo capitolo analizza la sicurezza della soluzione presentata in WP2 rispetto al modello definito in WP1. L'analisi procede per categoria di proprietà — autenticità, unicità, segretezza, integrità, verificabilità individuale e verificabilità universale — e, per ciascuna, individua gli avversari del paragrafo 1.2 in grado di minacciarla, descrive il loro attacco contro i meccanismi di WP2 e valuta l'esito. La valutazione di ciascuna proprietà è qualitativa e assume uno di tre livelli: soddisfatta (il meccanismo la garantisce contro tutti gli avversari del modello), parzialmente soddisfatta (garantita contro gli avversari realistici ma non contro uno scenario massimale esplicitamente dichiarato in WP1), non soddisfatta (il modello non la garantisce con gli strumenti adottati). Per le proprietà non pienamente soddisfatte si discutono le alternative considerate e le ragioni per cui non migliorano la proprietà senza degradarne altre. Tutte le valutazioni si fondano sulle assunzioni di fiducia dichiarate in §1.5; il superamento di tali assunzioni esula dal perimetro analizzato.</w:t>
       </w:r>
     </w:p>
     <w:p>

</xml_diff>